<commit_message>
Backfill missing card images from pokemontcg.io
tcgdex has no scans for ~1,400 cards (Shiny Vault, trainer galleries,
promos, vintage e-sets). Fall back to pokemontcg.io images in ingest,
retry its flaky /sets endpoint, and handle its _hires.png URLs in
lowResCardImage. One-off backfill script filled 788 in production.

Co-Authored-By: Claude Fable 5 <noreply@anthropic.com>
</commit_message>
<xml_diff>
--- a/BinderSync Launch Checklist.docx
+++ b/BinderSync Launch Checklist.docx
@@ -1713,6 +1713,69 @@
       </w:r>
       <w:r>
         <w:t xml:space="preserve">Review tcgdex image-hotlinking terms; if needed, mirror card images to our own storage as a follow-up.</w:t>
+      </w:r>
+    </w:p>
+    <w:p>
+      <w:pPr>
+        <w:pStyle w:val="ListParagraph"/>
+        <w:numPr>
+          <w:ilvl w:val="0"/>
+          <w:numId w:val="2"/>
+        </w:numPr>
+        <w:spacing w:after="60" w:line="276"/>
+      </w:pPr>
+      <w:r>
+        <w:rPr>
+          <w:b/>
+          <w:bCs/>
+          <w:color w:val="2F6F4F"/>
+        </w:rPr>
+        <w:t xml:space="preserve">[CLAUDE] </w:t>
+      </w:r>
+      <w:r>
+        <w:t xml:space="preserve">Add a “Forgot password?” link on the login page — there is currently no recovery path for locked-out users. Ships with the Resend password-reset flow in Step 7.</w:t>
+      </w:r>
+    </w:p>
+    <w:p>
+      <w:pPr>
+        <w:pStyle w:val="ListParagraph"/>
+        <w:numPr>
+          <w:ilvl w:val="0"/>
+          <w:numId w:val="2"/>
+        </w:numPr>
+        <w:spacing w:after="60" w:line="276"/>
+      </w:pPr>
+      <w:r>
+        <w:rPr>
+          <w:b/>
+          <w:bCs/>
+          <w:color w:val="2F6F4F"/>
+        </w:rPr>
+        <w:t xml:space="preserve">[CLAUDE] </w:t>
+      </w:r>
+      <w:r>
+        <w:t xml:space="preserve">Clearer signup call-to-action: replace the small “FREE” badge with an explicit Create Free Account button for signed-out visitors, keeping My Collection beside it.</w:t>
+      </w:r>
+    </w:p>
+    <w:p>
+      <w:pPr>
+        <w:pStyle w:val="ListParagraph"/>
+        <w:numPr>
+          <w:ilvl w:val="0"/>
+          <w:numId w:val="2"/>
+        </w:numPr>
+        <w:spacing w:after="60" w:line="276"/>
+      </w:pPr>
+      <w:r>
+        <w:rPr>
+          <w:b/>
+          <w:bCs/>
+          <w:color w:val="2F6F4F"/>
+        </w:rPr>
+        <w:t xml:space="preserve">[CLAUDE] </w:t>
+      </w:r>
+      <w:r>
+        <w:t xml:space="preserve">Trust links before promoting: Privacy Policy, Terms of Service, and Contact pages, linked in the footer and next to the account-creation form. I draft them; you give the wording a once-over (and the legal review above covers the marketplace angle).</w:t>
       </w:r>
     </w:p>
     <w:p>

</xml_diff>